<commit_message>
docs: document GoPhish simulation boundary
</commit_message>
<xml_diff>
--- a/docs/Karna_Accuracy_Evaluation_Report.docx
+++ b/docs/Karna_Accuracy_Evaluation_Report.docx
@@ -1161,7 +1161,7 @@
                 <w:color w:val="141D27"/>
                 <w:sz w:val="18"/>
               </w:rPr>
-              <w:t>2</w:t>
+              <w:t>5</w:t>
             </w:r>
           </w:p>
         </w:tc>
@@ -1201,7 +1201,7 @@
                 <w:color w:val="141D27"/>
                 <w:sz w:val="18"/>
               </w:rPr>
-              <w:t>23</w:t>
+              <w:t>20</w:t>
             </w:r>
           </w:p>
         </w:tc>
@@ -1241,7 +1241,7 @@
                 <w:color w:val="141D27"/>
                 <w:sz w:val="18"/>
               </w:rPr>
-              <w:t>0.667</w:t>
+              <w:t>0.833</w:t>
             </w:r>
           </w:p>
         </w:tc>
@@ -1261,7 +1261,7 @@
                 <w:color w:val="141D27"/>
                 <w:sz w:val="18"/>
               </w:rPr>
-              <w:t>0.333</w:t>
+              <w:t>0.556</w:t>
             </w:r>
           </w:p>
         </w:tc>
@@ -1281,7 +1281,7 @@
                 <w:color w:val="141D27"/>
                 <w:sz w:val="18"/>
               </w:rPr>
-              <w:t>0.444</w:t>
+              <w:t>0.667</w:t>
             </w:r>
           </w:p>
         </w:tc>
@@ -1301,7 +1301,7 @@
                 <w:color w:val="141D27"/>
                 <w:sz w:val="18"/>
               </w:rPr>
-              <w:t>0.042</w:t>
+              <w:t>0.048</w:t>
             </w:r>
           </w:p>
         </w:tc>
@@ -1889,7 +1889,7 @@
                 <w:color w:val="141D27"/>
                 <w:sz w:val="18"/>
               </w:rPr>
-              <w:t>5</w:t>
+              <w:t>2</w:t>
             </w:r>
           </w:p>
         </w:tc>
@@ -1929,7 +1929,7 @@
                 <w:color w:val="141D27"/>
                 <w:sz w:val="18"/>
               </w:rPr>
-              <w:t>25</w:t>
+              <w:t>28</w:t>
             </w:r>
           </w:p>
         </w:tc>

</xml_diff>